<commit_message>
Quantify Inspiro/Bob's Business bullets, split Cloud Platforms into per-cloud lines
Adds the ~500 user Azure-to-Azure migration figure to the Inspiro bullet
and the 100% SLA figure to the Bob's Business bullet, and splits the
combined Cloud Platforms line into separate Azure/AWS/GCP entries so
each cloud is its own keyword-visible line. Applied consistently across
index.html and the tracked Louis_Ross_CV.docx/.pdf, which had fallen
out of sync with the site copy.

Co-Authored-By: Claude Sonnet 5 <noreply@anthropic.com>
</commit_message>
<xml_diff>
--- a/Louis_Ross_CV.docx
+++ b/Louis_Ross_CV.docx
@@ -112,7 +112,61 @@
           <w:sz w:val="19"/>
           <w:szCs w:val="19"/>
         </w:rPr>
-        <w:t xml:space="preserve">Cloud Platforms &amp; IaC — Microsoft Azure (IaaS/PaaS: VMs, networking, storage, App Services), AWS (EC2, VPC, S3, IAM), GCP, Terraform, hybrid cloud environments</w:t>
+        <w:t xml:space="preserve">Microsoft Azure — IaaS/PaaS: VMs, networking, storage, App Services</w:t>
+      </w:r>
+    </w:p>
+    <w:p>
+      <w:pPr>
+        <w:pStyle w:val="ListParagraph"/>
+        <w:numPr>
+          <w:ilvl w:val="0"/>
+          <w:numId w:val="2"/>
+        </w:numPr>
+        <w:spacing w:after="6" w:line="216"/>
+      </w:pPr>
+      <w:r>
+        <w:rPr>
+          <w:rFonts w:ascii="Times New Roman" w:cs="Times New Roman" w:eastAsia="Times New Roman" w:hAnsi="Times New Roman"/>
+          <w:sz w:val="19"/>
+          <w:szCs w:val="19"/>
+        </w:rPr>
+        <w:t xml:space="preserve">AWS — EC2, VPC, S3, IAM</w:t>
+      </w:r>
+    </w:p>
+    <w:p>
+      <w:pPr>
+        <w:pStyle w:val="ListParagraph"/>
+        <w:numPr>
+          <w:ilvl w:val="0"/>
+          <w:numId w:val="2"/>
+        </w:numPr>
+        <w:spacing w:after="6" w:line="216"/>
+      </w:pPr>
+      <w:r>
+        <w:rPr>
+          <w:rFonts w:ascii="Times New Roman" w:cs="Times New Roman" w:eastAsia="Times New Roman" w:hAnsi="Times New Roman"/>
+          <w:sz w:val="19"/>
+          <w:szCs w:val="19"/>
+        </w:rPr>
+        <w:t xml:space="preserve">GCP — personal infrastructure projects</w:t>
+      </w:r>
+    </w:p>
+    <w:p>
+      <w:pPr>
+        <w:pStyle w:val="ListParagraph"/>
+        <w:numPr>
+          <w:ilvl w:val="0"/>
+          <w:numId w:val="2"/>
+        </w:numPr>
+        <w:spacing w:after="6" w:line="216"/>
+      </w:pPr>
+      <w:r>
+        <w:rPr>
+          <w:rFonts w:ascii="Times New Roman" w:cs="Times New Roman" w:eastAsia="Times New Roman" w:hAnsi="Times New Roman"/>
+          <w:sz w:val="19"/>
+          <w:szCs w:val="19"/>
+        </w:rPr>
+        <w:t xml:space="preserve">Infrastructure as Code — Terraform, hybrid cloud environments</w:t>
       </w:r>
     </w:p>
     <w:p>
@@ -284,7 +338,7 @@
           <w:sz w:val="19"/>
           <w:szCs w:val="19"/>
         </w:rPr>
-        <w:t xml:space="preserve">Administer and maintain Azure cloud infrastructure across a distributed enterprise environment, managing security posture, governance controls, and platform improvements alongside an external MSP.</w:t>
+        <w:t xml:space="preserve">Administer and maintain Azure cloud infrastructure across a distributed enterprise environment, including an Azure-to-Azure migration of approximately 500 users, while managing security posture, governance controls, and platform improvements alongside an external MSP.</w:t>
       </w:r>
     </w:p>
     <w:p>
@@ -473,7 +527,7 @@
           <w:sz w:val="19"/>
           <w:szCs w:val="19"/>
         </w:rPr>
-        <w:t xml:space="preserve">Implemented monitoring and alerting using Prometheus, Grafana, and New Relic; participated in 24/7 on-call support, resolving critical incidents within SLA.</w:t>
+        <w:t xml:space="preserve">Implemented monitoring and alerting using Prometheus, Grafana, and New Relic; participated in 24/7 on-call support, resolving critical incidents while maintaining 100% SLA.</w:t>
       </w:r>
     </w:p>
     <w:p>

</xml_diff>